<commit_message>
Extend shared biomarker working paper with PPD source audit and sole Udita byline
</commit_message>
<xml_diff>
--- a/paper/manuscript-times.docx
+++ b/paper/manuscript-times.docx
@@ -131,6 +131,17 @@
           <w:rFonts w:ascii="Times New Roman" w:hAnsi="Times New Roman"/>
         </w:rPr>
         <w:t xml:space="preserve">study</w:t>
+      </w:r>
+    </w:p>
+    <w:p>
+      <w:pPr>
+        <w:jc w:val="center"/>
+      </w:pPr>
+      <w:r>
+        <w:rPr>
+          <w:rFonts w:ascii="Times New Roman" w:hAnsi="Times New Roman"/>
+        </w:rPr>
+        <w:t>Udita Phookan</w:t>
       </w:r>
     </w:p>
     <w:p>

</xml_diff>